<commit_message>
Implementare generare return.docx + update echipamente returnate
</commit_message>
<xml_diff>
--- a/src/templates/return.docx
+++ b/src/templates/return.docx
@@ -117,6 +117,7 @@
         </w:rPr>
         <w:t>{</w:t>
       </w:r>
+      <w:proofErr w:type="spellStart"/>
       <w:r>
         <w:rPr>
           <w:rFonts w:ascii="Calibri" w:hAnsi="Calibri"/>
@@ -125,8 +126,9 @@
           <w:szCs w:val="28"/>
           <w:lang w:val="ro-RO"/>
         </w:rPr>
-        <w:t>fisa</w:t>
-      </w:r>
+        <w:t>id</w:t>
+      </w:r>
+      <w:proofErr w:type="spellEnd"/>
       <w:r>
         <w:rPr>
           <w:rFonts w:ascii="Calibri" w:hAnsi="Calibri"/>
@@ -175,7 +177,7 @@
           <w:szCs w:val="28"/>
           <w:lang w:val="ro-RO"/>
         </w:rPr>
-        <w:t>{dat</w:t>
+        <w:t>{</w:t>
       </w:r>
       <w:r>
         <w:rPr>
@@ -185,7 +187,7 @@
           <w:szCs w:val="28"/>
           <w:lang w:val="ro-RO"/>
         </w:rPr>
-        <w:t>a</w:t>
+        <w:t>date</w:t>
       </w:r>
       <w:r>
         <w:rPr>
@@ -342,26 +344,9 @@
           <w:szCs w:val="28"/>
           <w:lang w:val="ro-RO"/>
         </w:rPr>
-        <w:t xml:space="preserve">{primitor}, </w:t>
-      </w:r>
-      <w:r>
-        <w:rPr>
-          <w:rFonts w:ascii="Calibri" w:hAnsi="Calibri"/>
-          <w:sz w:val="22"/>
-          <w:szCs w:val="22"/>
-          <w:lang w:val="ro-RO"/>
-        </w:rPr>
-        <w:t>de la punctul de lucru</w:t>
-      </w:r>
-      <w:r>
-        <w:rPr>
-          <w:rFonts w:ascii="Calibri" w:hAnsi="Calibri"/>
-          <w:sz w:val="22"/>
-          <w:szCs w:val="22"/>
-          <w:lang w:val="ro-RO"/>
-        </w:rPr>
-        <w:t xml:space="preserve"> </w:t>
-      </w:r>
+        <w:t>{</w:t>
+      </w:r>
+      <w:proofErr w:type="spellStart"/>
       <w:r>
         <w:rPr>
           <w:rFonts w:ascii="Calibri" w:hAnsi="Calibri"/>
@@ -370,9 +355,9 @@
           <w:szCs w:val="28"/>
           <w:lang w:val="ro-RO"/>
         </w:rPr>
-        <w:t>{</w:t>
-      </w:r>
-      <w:proofErr w:type="spellStart"/>
+        <w:t>recipientPerson</w:t>
+      </w:r>
+      <w:proofErr w:type="spellEnd"/>
       <w:r>
         <w:rPr>
           <w:rFonts w:ascii="Calibri" w:hAnsi="Calibri"/>
@@ -381,7 +366,46 @@
           <w:szCs w:val="28"/>
           <w:lang w:val="ro-RO"/>
         </w:rPr>
-        <w:t>locatie</w:t>
+        <w:t xml:space="preserve">}, </w:t>
+      </w:r>
+      <w:r>
+        <w:rPr>
+          <w:rFonts w:ascii="Calibri" w:hAnsi="Calibri"/>
+          <w:sz w:val="22"/>
+          <w:szCs w:val="22"/>
+          <w:lang w:val="ro-RO"/>
+        </w:rPr>
+        <w:t>de la punctul de lucru</w:t>
+      </w:r>
+      <w:r>
+        <w:rPr>
+          <w:rFonts w:ascii="Calibri" w:hAnsi="Calibri"/>
+          <w:sz w:val="22"/>
+          <w:szCs w:val="22"/>
+          <w:lang w:val="ro-RO"/>
+        </w:rPr>
+        <w:t xml:space="preserve"> </w:t>
+      </w:r>
+      <w:r>
+        <w:rPr>
+          <w:rFonts w:ascii="Calibri" w:hAnsi="Calibri"/>
+          <w:b/>
+          <w:sz w:val="28"/>
+          <w:szCs w:val="28"/>
+          <w:lang w:val="ro-RO"/>
+        </w:rPr>
+        <w:t>{</w:t>
+      </w:r>
+      <w:proofErr w:type="spellStart"/>
+      <w:r>
+        <w:rPr>
+          <w:rFonts w:ascii="Calibri" w:hAnsi="Calibri"/>
+          <w:b/>
+          <w:sz w:val="28"/>
+          <w:szCs w:val="28"/>
+          <w:lang w:val="ro-RO"/>
+        </w:rPr>
+        <w:t>project</w:t>
       </w:r>
       <w:proofErr w:type="spellEnd"/>
       <w:r>
@@ -568,7 +592,7 @@
                 <w:szCs w:val="22"/>
                 <w:lang w:val="ro-RO"/>
               </w:rPr>
-              <w:t>{#echipament}</w:t>
+              <w:t>{#</w:t>
             </w:r>
             <w:r>
               <w:rPr>
@@ -577,7 +601,43 @@
                 <w:szCs w:val="22"/>
                 <w:lang w:val="ro-RO"/>
               </w:rPr>
-              <w:t xml:space="preserve">{tip} </w:t>
+              <w:t>equipment</w:t>
+            </w:r>
+            <w:r>
+              <w:rPr>
+                <w:rFonts w:ascii="Calibri" w:hAnsi="Calibri"/>
+                <w:sz w:val="22"/>
+                <w:szCs w:val="22"/>
+                <w:lang w:val="ro-RO"/>
+              </w:rPr>
+              <w:t>}</w:t>
+            </w:r>
+            <w:r>
+              <w:rPr>
+                <w:rFonts w:ascii="Calibri" w:hAnsi="Calibri"/>
+                <w:sz w:val="22"/>
+                <w:szCs w:val="22"/>
+                <w:lang w:val="ro-RO"/>
+              </w:rPr>
+              <w:t>{</w:t>
+            </w:r>
+            <w:r>
+              <w:rPr>
+                <w:rFonts w:ascii="Calibri" w:hAnsi="Calibri"/>
+                <w:sz w:val="22"/>
+                <w:szCs w:val="22"/>
+                <w:lang w:val="ro-RO"/>
+              </w:rPr>
+              <w:t>type</w:t>
+            </w:r>
+            <w:r>
+              <w:rPr>
+                <w:rFonts w:ascii="Calibri" w:hAnsi="Calibri"/>
+                <w:sz w:val="22"/>
+                <w:szCs w:val="22"/>
+                <w:lang w:val="ro-RO"/>
+              </w:rPr>
+              <w:t xml:space="preserve">} </w:t>
             </w:r>
             <w:r>
               <w:rPr>
@@ -615,6 +675,7 @@
               </w:rPr>
               <w:t>{</w:t>
             </w:r>
+            <w:proofErr w:type="spellStart"/>
             <w:r>
               <w:rPr>
                 <w:rFonts w:ascii="Calibri" w:hAnsi="Calibri"/>
@@ -624,6 +685,16 @@
               </w:rPr>
               <w:t>serie</w:t>
             </w:r>
+            <w:r>
+              <w:rPr>
+                <w:rFonts w:ascii="Calibri" w:hAnsi="Calibri"/>
+                <w:sz w:val="22"/>
+                <w:szCs w:val="22"/>
+                <w:lang w:val="ro-RO"/>
+              </w:rPr>
+              <w:t>s</w:t>
+            </w:r>
+            <w:proofErr w:type="spellEnd"/>
             <w:r>
               <w:rPr>
                 <w:rFonts w:ascii="Calibri" w:hAnsi="Calibri"/>
@@ -678,7 +749,27 @@
                 <w:szCs w:val="22"/>
                 <w:lang w:val="ro-RO"/>
               </w:rPr>
-              <w:t>}{/echipament}</w:t>
+              <w:t>}{/</w:t>
+            </w:r>
+            <w:proofErr w:type="spellStart"/>
+            <w:r>
+              <w:rPr>
+                <w:rFonts w:ascii="Calibri" w:hAnsi="Calibri"/>
+                <w:sz w:val="22"/>
+                <w:szCs w:val="22"/>
+                <w:lang w:val="ro-RO"/>
+              </w:rPr>
+              <w:t>equipment</w:t>
+            </w:r>
+            <w:proofErr w:type="spellEnd"/>
+            <w:r>
+              <w:rPr>
+                <w:rFonts w:ascii="Calibri" w:hAnsi="Calibri"/>
+                <w:sz w:val="22"/>
+                <w:szCs w:val="22"/>
+                <w:lang w:val="ro-RO"/>
+              </w:rPr>
+              <w:t>}</w:t>
             </w:r>
           </w:p>
         </w:tc>
@@ -980,7 +1071,7 @@
                 <w:szCs w:val="22"/>
                 <w:lang w:val="ro-RO"/>
               </w:rPr>
-              <w:t>predator</w:t>
+              <w:t>handoverPerson</w:t>
             </w:r>
             <w:proofErr w:type="spellEnd"/>
             <w:r>
@@ -1132,7 +1223,29 @@
                 <w:szCs w:val="22"/>
                 <w:lang w:val="ro-RO"/>
               </w:rPr>
-              <w:t>{primitor}</w:t>
+              <w:t>{</w:t>
+            </w:r>
+            <w:proofErr w:type="spellStart"/>
+            <w:r>
+              <w:rPr>
+                <w:rFonts w:ascii="Calibri" w:hAnsi="Calibri"/>
+                <w:bCs/>
+                <w:sz w:val="22"/>
+                <w:szCs w:val="22"/>
+                <w:lang w:val="ro-RO"/>
+              </w:rPr>
+              <w:t>recipientPerson</w:t>
+            </w:r>
+            <w:proofErr w:type="spellEnd"/>
+            <w:r>
+              <w:rPr>
+                <w:rFonts w:ascii="Calibri" w:hAnsi="Calibri"/>
+                <w:bCs/>
+                <w:sz w:val="22"/>
+                <w:szCs w:val="22"/>
+                <w:lang w:val="ro-RO"/>
+              </w:rPr>
+              <w:t>}</w:t>
             </w:r>
           </w:p>
         </w:tc>
@@ -1264,7 +1377,7 @@
           <v:path o:extrusionok="f" gradientshapeok="t" o:connecttype="rect"/>
           <o:lock v:ext="edit" aspectratio="t"/>
         </v:shapetype>
-        <v:shape id="_x0000_s2050" type="#_x0000_t75" style="position:absolute;margin-left:-3.6pt;margin-top:10.25pt;width:336.6pt;height:18pt;z-index:-4">
+        <v:shape id="_x0000_s2050" type="#_x0000_t75" style="position:absolute;margin-left:-3.6pt;margin-top:10.25pt;width:336.6pt;height:18pt;z-index:-3">
           <v:imagedata r:id="rId1" o:title=""/>
         </v:shape>
       </w:pict>
@@ -1505,7 +1618,7 @@
           <v:path o:extrusionok="f" gradientshapeok="t" o:connecttype="rect"/>
           <o:lock v:ext="edit" aspectratio="t"/>
         </v:shapetype>
-        <v:shape id="_x0000_s2062" type="#_x0000_t75" style="position:absolute;left:0;text-align:left;margin-left:-1.3pt;margin-top:-.85pt;width:334.3pt;height:18pt;z-index:-3">
+        <v:shape id="_x0000_s2062" type="#_x0000_t75" style="position:absolute;left:0;text-align:left;margin-left:-1.3pt;margin-top:-.85pt;width:334.3pt;height:18pt;z-index:-2">
           <v:imagedata r:id="rId1" o:title=""/>
         </v:shape>
       </w:pict>
@@ -1911,7 +2024,7 @@
           <v:path o:extrusionok="f" gradientshapeok="t" o:connecttype="rect"/>
           <o:lock v:ext="edit" aspectratio="t"/>
         </v:shapetype>
-        <v:shape id="_x0000_i1025" type="#_x0000_t75" style="width:209.55pt;height:47.55pt" o:allowoverlap="f">
+        <v:shape id="_x0000_i1025" type="#_x0000_t75" style="width:209.25pt;height:47.25pt" o:allowoverlap="f">
           <v:imagedata r:id="rId1" o:title="logo"/>
         </v:shape>
       </w:pict>
@@ -1963,7 +2076,7 @@
           <v:path o:extrusionok="f" gradientshapeok="t" o:connecttype="rect"/>
           <o:lock v:ext="edit" aspectratio="t"/>
         </v:shapetype>
-        <v:shape id="Picture 1" o:spid="_x0000_s2072" type="#_x0000_t75" alt="header" style="position:absolute;left:0;text-align:left;margin-left:.3pt;margin-top:-15.65pt;width:114pt;height:114pt;z-index:4;visibility:visible;mso-wrap-style:square;mso-position-horizontal-relative:text;mso-position-vertical-relative:text;mso-width-relative:page;mso-height-relative:page">
+        <v:shape id="Picture 1" o:spid="_x0000_s2072" type="#_x0000_t75" alt="header" style="position:absolute;left:0;text-align:left;margin-left:.3pt;margin-top:-15.65pt;width:114pt;height:114pt;z-index:1;visibility:visible;mso-wrap-style:square;mso-position-horizontal-relative:text;mso-position-vertical-relative:text;mso-width-relative:page;mso-height-relative:page">
           <v:imagedata r:id="rId1" o:title="header"/>
           <w10:wrap type="square"/>
         </v:shape>
@@ -1974,7 +2087,7 @@
         <w:noProof/>
       </w:rPr>
       <w:pict w14:anchorId="024DDCAE">
-        <v:shape id="_x0000_s2070" type="#_x0000_t75" style="position:absolute;left:0;text-align:left;margin-left:324pt;margin-top:-30.6pt;width:153.2pt;height:198pt;z-index:-2">
+        <v:shape id="_x0000_s2070" type="#_x0000_t75" style="position:absolute;left:0;text-align:left;margin-left:324pt;margin-top:-30.6pt;width:153.2pt;height:198pt;z-index:-1">
           <v:imagedata r:id="rId2" o:title="greycut"/>
           <w10:wrap type="square"/>
         </v:shape>
@@ -2508,7 +2621,7 @@
     <w:rPrDefault>
       <w:rPr>
         <w:rFonts w:ascii="Calibri" w:eastAsia="Calibri" w:hAnsi="Calibri" w:cs="Times New Roman"/>
-        <w:lang w:val="en-US" w:eastAsia="en-US" w:bidi="ar-SA"/>
+        <w:lang w:val="ro-RO" w:eastAsia="ro-RO" w:bidi="ar-SA"/>
       </w:rPr>
     </w:rPrDefault>
     <w:pPrDefault/>
@@ -2901,6 +3014,7 @@
     <w:rPr>
       <w:sz w:val="22"/>
       <w:szCs w:val="22"/>
+      <w:lang w:val="en-US" w:eastAsia="en-US"/>
     </w:rPr>
   </w:style>
   <w:style w:type="character" w:default="1" w:styleId="DefaultParagraphFont">
@@ -3011,6 +3125,7 @@
     <w:rPr>
       <w:sz w:val="22"/>
       <w:szCs w:val="22"/>
+      <w:lang w:val="en-US" w:eastAsia="en-US"/>
     </w:rPr>
   </w:style>
   <w:style w:type="paragraph" w:styleId="DocumentMap">

</xml_diff>